<commit_message>
docs: adiciona o caso de uso Responder Anamnese no Documento de Arquitetura. Issue #74
</commit_message>
<xml_diff>
--- a/AnaliseProjeto/Documento de Arquitetura-BemMeCare.docx
+++ b/AnaliseProjeto/Documento de Arquitetura-BemMeCare.docx
@@ -2178,7 +2178,7 @@
     </w:p>
     <w:sdt>
       <w:sdtPr>
-        <w:id w:val="-1914865963"/>
+        <w:id w:val="1590924877"/>
         <w:docPartObj>
           <w:docPartGallery w:val="Table of Contents"/>
           <w:docPartUnique w:val="1"/>
@@ -7216,6 +7216,42 @@
     </w:p>
     <w:p>
       <w:pPr>
+        <w:keepNext w:val="0"/>
+        <w:keepLines w:val="0"/>
+        <w:pageBreakBefore w:val="0"/>
+        <w:widowControl w:val="0"/>
+        <w:numPr>
+          <w:ilvl w:val="0"/>
+          <w:numId w:val="6"/>
+        </w:numPr>
+        <w:pBdr>
+          <w:top w:space="0" w:sz="0" w:val="nil"/>
+          <w:left w:space="0" w:sz="0" w:val="nil"/>
+          <w:bottom w:space="0" w:sz="0" w:val="nil"/>
+          <w:right w:space="0" w:sz="0" w:val="nil"/>
+          <w:between w:space="0" w:sz="0" w:val="nil"/>
+        </w:pBdr>
+        <w:shd w:fill="auto" w:val="clear"/>
+        <w:spacing w:after="120" w:before="0" w:line="240" w:lineRule="auto"/>
+        <w:ind w:left="1440" w:right="0" w:hanging="360"/>
+        <w:jc w:val="both"/>
+        <w:rPr>
+          <w:sz w:val="24"/>
+          <w:szCs w:val="24"/>
+          <w:u w:val="none"/>
+        </w:rPr>
+      </w:pPr>
+      <w:r>
+        <w:rPr>
+          <w:sz w:val="24"/>
+          <w:szCs w:val="24"/>
+          <w:rtl w:val="0"/>
+        </w:rPr>
+        <w:t xml:space="preserve">UC14_Responder Anamnese;</w:t>
+      </w:r>
+    </w:p>
+    <w:p>
+      <w:pPr>
         <w:tabs>
           <w:tab w:val="left" w:leader="none" w:pos="8241"/>
         </w:tabs>
@@ -7254,14 +7290,14 @@
         <w:rPr/>
         <w:drawing>
           <wp:inline distB="114300" distT="114300" distL="114300" distR="114300">
-            <wp:extent cx="5943600" cy="4762500"/>
+            <wp:extent cx="5943600" cy="4470400"/>
             <wp:effectExtent b="0" l="0" r="0" t="0"/>
-            <wp:docPr id="2" name="image6.png"/>
+            <wp:docPr id="3" name="image4.png"/>
             <a:graphic>
               <a:graphicData uri="http://schemas.openxmlformats.org/drawingml/2006/picture">
                 <pic:pic>
                   <pic:nvPicPr>
-                    <pic:cNvPr id="0" name="image6.png"/>
+                    <pic:cNvPr id="0" name="image4.png"/>
                     <pic:cNvPicPr preferRelativeResize="0"/>
                   </pic:nvPicPr>
                   <pic:blipFill>
@@ -7274,7 +7310,7 @@
                   <pic:spPr>
                     <a:xfrm>
                       <a:off x="0" y="0"/>
-                      <a:ext cx="5943600" cy="4762500"/>
+                      <a:ext cx="5943600" cy="4470400"/>
                     </a:xfrm>
                     <a:prstGeom prst="rect"/>
                     <a:ln/>
@@ -7819,12 +7855,12 @@
           <wp:inline distB="114300" distT="114300" distL="114300" distR="114300">
             <wp:extent cx="5283305" cy="4254609"/>
             <wp:effectExtent b="0" l="0" r="0" t="0"/>
-            <wp:docPr id="1" name="image5.png"/>
+            <wp:docPr id="1" name="image6.png"/>
             <a:graphic>
               <a:graphicData uri="http://schemas.openxmlformats.org/drawingml/2006/picture">
                 <pic:pic>
                   <pic:nvPicPr>
-                    <pic:cNvPr id="0" name="image5.png"/>
+                    <pic:cNvPr id="0" name="image6.png"/>
                     <pic:cNvPicPr preferRelativeResize="0"/>
                   </pic:nvPicPr>
                   <pic:blipFill>
@@ -8123,12 +8159,12 @@
           <wp:inline distB="114300" distT="114300" distL="114300" distR="114300">
             <wp:extent cx="5943600" cy="5295900"/>
             <wp:effectExtent b="0" l="0" r="0" t="0"/>
-            <wp:docPr id="4" name="image1.png"/>
+            <wp:docPr id="4" name="image2.png"/>
             <a:graphic>
               <a:graphicData uri="http://schemas.openxmlformats.org/drawingml/2006/picture">
                 <pic:pic>
                   <pic:nvPicPr>
-                    <pic:cNvPr id="0" name="image1.png"/>
+                    <pic:cNvPr id="0" name="image2.png"/>
                     <pic:cNvPicPr preferRelativeResize="0"/>
                   </pic:nvPicPr>
                   <pic:blipFill>
@@ -8443,12 +8479,12 @@
           <wp:inline distB="114300" distT="114300" distL="114300" distR="114300">
             <wp:extent cx="5943600" cy="3886200"/>
             <wp:effectExtent b="0" l="0" r="0" t="0"/>
-            <wp:docPr id="6" name="image3.png"/>
+            <wp:docPr id="6" name="image5.png"/>
             <a:graphic>
               <a:graphicData uri="http://schemas.openxmlformats.org/drawingml/2006/picture">
                 <pic:pic>
                   <pic:nvPicPr>
-                    <pic:cNvPr id="0" name="image3.png"/>
+                    <pic:cNvPr id="0" name="image5.png"/>
                     <pic:cNvPicPr preferRelativeResize="0"/>
                   </pic:nvPicPr>
                   <pic:blipFill>
@@ -8581,12 +8617,12 @@
           <wp:inline distB="114300" distT="114300" distL="114300" distR="114300">
             <wp:extent cx="4669367" cy="2745077"/>
             <wp:effectExtent b="0" l="0" r="0" t="0"/>
-            <wp:docPr id="5" name="image2.png"/>
+            <wp:docPr id="5" name="image3.png"/>
             <a:graphic>
               <a:graphicData uri="http://schemas.openxmlformats.org/drawingml/2006/picture">
                 <pic:pic>
                   <pic:nvPicPr>
-                    <pic:cNvPr id="0" name="image2.png"/>
+                    <pic:cNvPr id="0" name="image3.png"/>
                     <pic:cNvPicPr preferRelativeResize="0"/>
                   </pic:nvPicPr>
                   <pic:blipFill>
@@ -8763,12 +8799,12 @@
           <wp:inline distB="114300" distT="114300" distL="114300" distR="114300">
             <wp:extent cx="5943600" cy="3683000"/>
             <wp:effectExtent b="0" l="0" r="0" t="0"/>
-            <wp:docPr id="3" name="image4.png"/>
+            <wp:docPr id="2" name="image1.png"/>
             <a:graphic>
               <a:graphicData uri="http://schemas.openxmlformats.org/drawingml/2006/picture">
                 <pic:pic>
                   <pic:nvPicPr>
-                    <pic:cNvPr id="0" name="image4.png"/>
+                    <pic:cNvPr id="0" name="image1.png"/>
                     <pic:cNvPicPr preferRelativeResize="0"/>
                   </pic:nvPicPr>
                   <pic:blipFill>

</xml_diff>

<commit_message>
docs: altera diagrama de implantação do Documento de Arquitetura. Issue #69
</commit_message>
<xml_diff>
--- a/AnaliseProjeto/Documento de Arquitetura-BemMeCare.docx
+++ b/AnaliseProjeto/Documento de Arquitetura-BemMeCare.docx
@@ -2178,7 +2178,7 @@
     </w:p>
     <w:sdt>
       <w:sdtPr>
-        <w:id w:val="1590924877"/>
+        <w:id w:val="1760294521"/>
         <w:docPartObj>
           <w:docPartGallery w:val="Table of Contents"/>
           <w:docPartUnique w:val="1"/>
@@ -7292,12 +7292,12 @@
           <wp:inline distB="114300" distT="114300" distL="114300" distR="114300">
             <wp:extent cx="5943600" cy="4470400"/>
             <wp:effectExtent b="0" l="0" r="0" t="0"/>
-            <wp:docPr id="3" name="image4.png"/>
+            <wp:docPr id="4" name="image2.png"/>
             <a:graphic>
               <a:graphicData uri="http://schemas.openxmlformats.org/drawingml/2006/picture">
                 <pic:pic>
                   <pic:nvPicPr>
-                    <pic:cNvPr id="0" name="image4.png"/>
+                    <pic:cNvPr id="0" name="image2.png"/>
                     <pic:cNvPicPr preferRelativeResize="0"/>
                   </pic:nvPicPr>
                   <pic:blipFill>
@@ -7855,7 +7855,7 @@
           <wp:inline distB="114300" distT="114300" distL="114300" distR="114300">
             <wp:extent cx="5283305" cy="4254609"/>
             <wp:effectExtent b="0" l="0" r="0" t="0"/>
-            <wp:docPr id="1" name="image6.png"/>
+            <wp:docPr id="2" name="image6.png"/>
             <a:graphic>
               <a:graphicData uri="http://schemas.openxmlformats.org/drawingml/2006/picture">
                 <pic:pic>
@@ -8142,29 +8142,23 @@
         </w:rPr>
         <w:t xml:space="preserve">Visão de Implantação</w:t>
       </w:r>
-      <w:r>
-        <w:rPr>
-          <w:rtl w:val="0"/>
-        </w:rPr>
-      </w:r>
-    </w:p>
-    <w:p>
-      <w:pPr>
-        <w:jc w:val="center"/>
+    </w:p>
+    <w:p>
+      <w:pPr>
         <w:rPr/>
       </w:pPr>
       <w:r>
         <w:rPr/>
         <w:drawing>
           <wp:inline distB="114300" distT="114300" distL="114300" distR="114300">
-            <wp:extent cx="5943600" cy="5295900"/>
+            <wp:extent cx="5943600" cy="5892800"/>
             <wp:effectExtent b="0" l="0" r="0" t="0"/>
-            <wp:docPr id="4" name="image2.png"/>
+            <wp:docPr id="1" name="image1.jpg"/>
             <a:graphic>
               <a:graphicData uri="http://schemas.openxmlformats.org/drawingml/2006/picture">
                 <pic:pic>
                   <pic:nvPicPr>
-                    <pic:cNvPr id="0" name="image2.png"/>
+                    <pic:cNvPr id="0" name="image1.jpg"/>
                     <pic:cNvPicPr preferRelativeResize="0"/>
                   </pic:nvPicPr>
                   <pic:blipFill>
@@ -8177,7 +8171,7 @@
                   <pic:spPr>
                     <a:xfrm>
                       <a:off x="0" y="0"/>
-                      <a:ext cx="5943600" cy="5295900"/>
+                      <a:ext cx="5943600" cy="5892800"/>
                     </a:xfrm>
                     <a:prstGeom prst="rect"/>
                     <a:ln/>
@@ -8479,12 +8473,12 @@
           <wp:inline distB="114300" distT="114300" distL="114300" distR="114300">
             <wp:extent cx="5943600" cy="3886200"/>
             <wp:effectExtent b="0" l="0" r="0" t="0"/>
-            <wp:docPr id="6" name="image5.png"/>
+            <wp:docPr id="6" name="image4.png"/>
             <a:graphic>
               <a:graphicData uri="http://schemas.openxmlformats.org/drawingml/2006/picture">
                 <pic:pic>
                   <pic:nvPicPr>
-                    <pic:cNvPr id="0" name="image5.png"/>
+                    <pic:cNvPr id="0" name="image4.png"/>
                     <pic:cNvPicPr preferRelativeResize="0"/>
                   </pic:nvPicPr>
                   <pic:blipFill>
@@ -8799,12 +8793,12 @@
           <wp:inline distB="114300" distT="114300" distL="114300" distR="114300">
             <wp:extent cx="5943600" cy="3683000"/>
             <wp:effectExtent b="0" l="0" r="0" t="0"/>
-            <wp:docPr id="2" name="image1.png"/>
+            <wp:docPr id="3" name="image5.png"/>
             <a:graphic>
               <a:graphicData uri="http://schemas.openxmlformats.org/drawingml/2006/picture">
                 <pic:pic>
                   <pic:nvPicPr>
-                    <pic:cNvPr id="0" name="image1.png"/>
+                    <pic:cNvPr id="0" name="image5.png"/>
                     <pic:cNvPicPr preferRelativeResize="0"/>
                   </pic:nvPicPr>
                   <pic:blipFill>

</xml_diff>

<commit_message>
docs: atualiza diagrama de implantação do Documento de Arquitetura. Close #85
</commit_message>
<xml_diff>
--- a/AnaliseProjeto/Documento de Arquitetura-BemMeCare.docx
+++ b/AnaliseProjeto/Documento de Arquitetura-BemMeCare.docx
@@ -2178,7 +2178,7 @@
     </w:p>
     <w:sdt>
       <w:sdtPr>
-        <w:id w:val="1760294521"/>
+        <w:id w:val="1326399684"/>
         <w:docPartObj>
           <w:docPartGallery w:val="Table of Contents"/>
           <w:docPartUnique w:val="1"/>
@@ -7292,12 +7292,12 @@
           <wp:inline distB="114300" distT="114300" distL="114300" distR="114300">
             <wp:extent cx="5943600" cy="4470400"/>
             <wp:effectExtent b="0" l="0" r="0" t="0"/>
-            <wp:docPr id="4" name="image2.png"/>
+            <wp:docPr id="3" name="image6.png"/>
             <a:graphic>
               <a:graphicData uri="http://schemas.openxmlformats.org/drawingml/2006/picture">
                 <pic:pic>
                   <pic:nvPicPr>
-                    <pic:cNvPr id="0" name="image2.png"/>
+                    <pic:cNvPr id="0" name="image6.png"/>
                     <pic:cNvPicPr preferRelativeResize="0"/>
                   </pic:nvPicPr>
                   <pic:blipFill>
@@ -7855,12 +7855,12 @@
           <wp:inline distB="114300" distT="114300" distL="114300" distR="114300">
             <wp:extent cx="5283305" cy="4254609"/>
             <wp:effectExtent b="0" l="0" r="0" t="0"/>
-            <wp:docPr id="2" name="image6.png"/>
+            <wp:docPr id="1" name="image4.png"/>
             <a:graphic>
               <a:graphicData uri="http://schemas.openxmlformats.org/drawingml/2006/picture">
                 <pic:pic>
                   <pic:nvPicPr>
-                    <pic:cNvPr id="0" name="image6.png"/>
+                    <pic:cNvPr id="0" name="image4.png"/>
                     <pic:cNvPicPr preferRelativeResize="0"/>
                   </pic:nvPicPr>
                   <pic:blipFill>
@@ -8151,14 +8151,14 @@
         <w:rPr/>
         <w:drawing>
           <wp:inline distB="114300" distT="114300" distL="114300" distR="114300">
-            <wp:extent cx="5943600" cy="5892800"/>
+            <wp:extent cx="5943600" cy="5397500"/>
             <wp:effectExtent b="0" l="0" r="0" t="0"/>
-            <wp:docPr id="1" name="image1.jpg"/>
+            <wp:docPr id="6" name="image5.jpg"/>
             <a:graphic>
               <a:graphicData uri="http://schemas.openxmlformats.org/drawingml/2006/picture">
                 <pic:pic>
                   <pic:nvPicPr>
-                    <pic:cNvPr id="0" name="image1.jpg"/>
+                    <pic:cNvPr id="0" name="image5.jpg"/>
                     <pic:cNvPicPr preferRelativeResize="0"/>
                   </pic:nvPicPr>
                   <pic:blipFill>
@@ -8171,7 +8171,7 @@
                   <pic:spPr>
                     <a:xfrm>
                       <a:off x="0" y="0"/>
-                      <a:ext cx="5943600" cy="5892800"/>
+                      <a:ext cx="5943600" cy="5397500"/>
                     </a:xfrm>
                     <a:prstGeom prst="rect"/>
                     <a:ln/>
@@ -8473,12 +8473,12 @@
           <wp:inline distB="114300" distT="114300" distL="114300" distR="114300">
             <wp:extent cx="5943600" cy="3886200"/>
             <wp:effectExtent b="0" l="0" r="0" t="0"/>
-            <wp:docPr id="6" name="image4.png"/>
+            <wp:docPr id="5" name="image1.png"/>
             <a:graphic>
               <a:graphicData uri="http://schemas.openxmlformats.org/drawingml/2006/picture">
                 <pic:pic>
                   <pic:nvPicPr>
-                    <pic:cNvPr id="0" name="image4.png"/>
+                    <pic:cNvPr id="0" name="image1.png"/>
                     <pic:cNvPicPr preferRelativeResize="0"/>
                   </pic:nvPicPr>
                   <pic:blipFill>
@@ -8611,12 +8611,12 @@
           <wp:inline distB="114300" distT="114300" distL="114300" distR="114300">
             <wp:extent cx="4669367" cy="2745077"/>
             <wp:effectExtent b="0" l="0" r="0" t="0"/>
-            <wp:docPr id="5" name="image3.png"/>
+            <wp:docPr id="4" name="image2.png"/>
             <a:graphic>
               <a:graphicData uri="http://schemas.openxmlformats.org/drawingml/2006/picture">
                 <pic:pic>
                   <pic:nvPicPr>
-                    <pic:cNvPr id="0" name="image3.png"/>
+                    <pic:cNvPr id="0" name="image2.png"/>
                     <pic:cNvPicPr preferRelativeResize="0"/>
                   </pic:nvPicPr>
                   <pic:blipFill>
@@ -8793,12 +8793,12 @@
           <wp:inline distB="114300" distT="114300" distL="114300" distR="114300">
             <wp:extent cx="5943600" cy="3683000"/>
             <wp:effectExtent b="0" l="0" r="0" t="0"/>
-            <wp:docPr id="3" name="image5.png"/>
+            <wp:docPr id="2" name="image3.png"/>
             <a:graphic>
               <a:graphicData uri="http://schemas.openxmlformats.org/drawingml/2006/picture">
                 <pic:pic>
                   <pic:nvPicPr>
-                    <pic:cNvPr id="0" name="image5.png"/>
+                    <pic:cNvPr id="0" name="image3.png"/>
                     <pic:cNvPicPr preferRelativeResize="0"/>
                   </pic:nvPicPr>
                   <pic:blipFill>

</xml_diff>